<commit_message>
Atualiza .gitignore e remove arquivos pesados do rastreamento
</commit_message>
<xml_diff>
--- a/docs/diario_analise_dados_macauba_cachos.docx
+++ b/docs/diario_analise_dados_macauba_cachos.docx
@@ -1098,6 +1098,134 @@
       <w:proofErr w:type="gramEnd"/>
     </w:p>
     <w:p/>
+    <w:p>
+      <w:proofErr w:type="spellStart"/>
+      <w:r>
+        <w:t>congigurei</w:t>
+      </w:r>
+      <w:proofErr w:type="spellEnd"/>
+      <w:r>
+        <w:t xml:space="preserve"> </w:t>
+      </w:r>
+      <w:proofErr w:type="spellStart"/>
+      <w:r>
+        <w:t>mnha</w:t>
+      </w:r>
+      <w:proofErr w:type="spellEnd"/>
+      <w:r>
+        <w:t xml:space="preserve"> identidade global:</w:t>
+      </w:r>
+      <w:r>
+        <w:br/>
+      </w:r>
+      <w:proofErr w:type="spellStart"/>
+      <w:r>
+        <w:t>git</w:t>
+      </w:r>
+      <w:proofErr w:type="spellEnd"/>
+      <w:r>
+        <w:t xml:space="preserve"> </w:t>
+      </w:r>
+      <w:proofErr w:type="spellStart"/>
+      <w:r>
+        <w:t>config</w:t>
+      </w:r>
+      <w:proofErr w:type="spellEnd"/>
+      <w:r>
+        <w:t xml:space="preserve"> </w:t>
+      </w:r>
+      <w:r>
+        <w:rPr>
+          <w:rStyle w:val="token"/>
+        </w:rPr>
+        <w:t>--</w:t>
+      </w:r>
+      <w:r>
+        <w:t>global user</w:t>
+      </w:r>
+      <w:r>
+        <w:rPr>
+          <w:rStyle w:val="token"/>
+        </w:rPr>
+        <w:t>.</w:t>
+      </w:r>
+      <w:r>
+        <w:t xml:space="preserve">name </w:t>
+      </w:r>
+      <w:r>
+        <w:rPr>
+          <w:rStyle w:val="token"/>
+        </w:rPr>
+        <w:t>"Christina Maria de Freitas Grupioni"</w:t>
+      </w:r>
+      <w:r>
+        <w:t xml:space="preserve"> </w:t>
+      </w:r>
+    </w:p>
+    <w:p>
+      <w:proofErr w:type="spellStart"/>
+      <w:r>
+        <w:t>git</w:t>
+      </w:r>
+      <w:proofErr w:type="spellEnd"/>
+      <w:r>
+        <w:t xml:space="preserve"> </w:t>
+      </w:r>
+      <w:proofErr w:type="spellStart"/>
+      <w:r>
+        <w:t>config</w:t>
+      </w:r>
+      <w:proofErr w:type="spellEnd"/>
+      <w:r>
+        <w:t xml:space="preserve"> </w:t>
+      </w:r>
+      <w:r>
+        <w:rPr>
+          <w:rStyle w:val="token"/>
+        </w:rPr>
+        <w:t>--</w:t>
+      </w:r>
+      <w:r>
+        <w:t xml:space="preserve">global </w:t>
+      </w:r>
+      <w:proofErr w:type="spellStart"/>
+      <w:proofErr w:type="gramStart"/>
+      <w:r>
+        <w:t>user</w:t>
+      </w:r>
+      <w:r>
+        <w:rPr>
+          <w:rStyle w:val="token"/>
+        </w:rPr>
+        <w:t>.</w:t>
+      </w:r>
+      <w:r>
+        <w:t>email</w:t>
+      </w:r>
+      <w:proofErr w:type="spellEnd"/>
+      <w:proofErr w:type="gramEnd"/>
+      <w:r>
+        <w:t xml:space="preserve"> </w:t>
+      </w:r>
+      <w:r>
+        <w:rPr>
+          <w:rStyle w:val="token"/>
+        </w:rPr>
+        <w:t>"</w:t>
+      </w:r>
+      <w:r>
+        <w:rPr>
+          <w:rStyle w:val="token"/>
+        </w:rPr>
+        <w:t>chrisgrupioni@gmail.com</w:t>
+      </w:r>
+      <w:r>
+        <w:rPr>
+          <w:rStyle w:val="token"/>
+        </w:rPr>
+        <w:t>"</w:t>
+      </w:r>
+    </w:p>
     <w:p/>
     <w:p/>
     <w:p/>
@@ -1558,6 +1686,11 @@
     <w:semiHidden/>
     <w:rsid w:val="00BA2041"/>
   </w:style>
+  <w:style w:type="character" w:customStyle="1" w:styleId="token">
+    <w:name w:val="token"/>
+    <w:basedOn w:val="Fontepargpadro"/>
+    <w:rsid w:val="008F6B0D"/>
+  </w:style>
 </w:styles>
 </file>
 

</xml_diff>